<commit_message>
docs: deployment guide, deployment status and the two crash fixes
- docs/DEPLOYMENT.md: the complete Convex + Vercel deployment guide, the
  environment variables and a troubleshooting table.
- The updates document now lists the deployment status (backend deployed,
  web app ready, GitHub pushed), the three manual steps that need the
  account of the owner, and the two crashes that were fixed.
</commit_message>
<xml_diff>
--- a/docs/Jotion-Updates-and-Next-Steps.docx
+++ b/docs/Jotion-Updates-and-Next-Steps.docx
@@ -4988,6 +4988,180 @@
           </w:p>
         </w:tc>
       </w:tr>
+      <w:tr>
+        <w:tc>
+          <w:tcPr>
+            <w:tcW w:type="dxa" w:w="2412"/>
+          </w:tcPr>
+          <w:p>
+            <w:r/>
+            <w:r>
+              <w:rPr>
+                <w:sz w:val="19"/>
+              </w:rPr>
+              <w:t>9</w:t>
+            </w:r>
+          </w:p>
+        </w:tc>
+        <w:tc>
+          <w:tcPr>
+            <w:tcW w:type="dxa" w:w="2412"/>
+          </w:tcPr>
+          <w:p>
+            <w:r/>
+            <w:r>
+              <w:rPr>
+                <w:sz w:val="19"/>
+              </w:rPr>
+              <w:t>`useSearchParams()` returns `null` while a route is statically rendered</w:t>
+            </w:r>
+          </w:p>
+        </w:tc>
+        <w:tc>
+          <w:tcPr>
+            <w:tcW w:type="dxa" w:w="2412"/>
+          </w:tcPr>
+          <w:p>
+            <w:r/>
+            <w:r>
+              <w:rPr>
+                <w:sz w:val="19"/>
+              </w:rPr>
+              <w:t>**The deployed app crashed with *“Cannot read properties of null (reading 'get')”*** on the pricing, settings and checkout pages</w:t>
+            </w:r>
+          </w:p>
+        </w:tc>
+        <w:tc>
+          <w:tcPr>
+            <w:tcW w:type="dxa" w:w="2412"/>
+          </w:tcPr>
+          <w:p>
+            <w:r/>
+            <w:r>
+              <w:rPr>
+                <w:sz w:val="19"/>
+              </w:rPr>
+              <w:t>`useSafeSearchParams()` always returns a `URLSearchParams` (regression test included)</w:t>
+            </w:r>
+          </w:p>
+        </w:tc>
+      </w:tr>
+      <w:tr>
+        <w:tc>
+          <w:tcPr>
+            <w:tcW w:type="dxa" w:w="2412"/>
+          </w:tcPr>
+          <w:p>
+            <w:r/>
+            <w:r>
+              <w:rPr>
+                <w:sz w:val="19"/>
+              </w:rPr>
+              <w:t>10</w:t>
+            </w:r>
+          </w:p>
+        </w:tc>
+        <w:tc>
+          <w:tcPr>
+            <w:tcW w:type="dxa" w:w="2412"/>
+          </w:tcPr>
+          <w:p>
+            <w:r/>
+            <w:r>
+              <w:rPr>
+                <w:sz w:val="19"/>
+              </w:rPr>
+              <w:t>The Clerk provider throws when the publishable key is missing</w:t>
+            </w:r>
+          </w:p>
+        </w:tc>
+        <w:tc>
+          <w:tcPr>
+            <w:tcW w:type="dxa" w:w="2412"/>
+          </w:tcPr>
+          <w:p>
+            <w:r/>
+            <w:r>
+              <w:rPr>
+                <w:sz w:val="19"/>
+              </w:rPr>
+              <w:t>A deployment without `NEXT_PUBLIC_CLERK_PUBLISHABLE_KEY` returned a 500 for every page</w:t>
+            </w:r>
+          </w:p>
+        </w:tc>
+        <w:tc>
+          <w:tcPr>
+            <w:tcW w:type="dxa" w:w="2412"/>
+          </w:tcPr>
+          <w:p>
+            <w:r/>
+            <w:r>
+              <w:rPr>
+                <w:sz w:val="19"/>
+              </w:rPr>
+              <w:t>`&lt;ConfigurationCheck /&gt;` renders a setup screen that lists the missing variables</w:t>
+            </w:r>
+          </w:p>
+        </w:tc>
+      </w:tr>
+      <w:tr>
+        <w:tc>
+          <w:tcPr>
+            <w:tcW w:type="dxa" w:w="2412"/>
+          </w:tcPr>
+          <w:p>
+            <w:r/>
+            <w:r>
+              <w:rPr>
+                <w:sz w:val="19"/>
+              </w:rPr>
+              <w:t>11</w:t>
+            </w:r>
+          </w:p>
+        </w:tc>
+        <w:tc>
+          <w:tcPr>
+            <w:tcW w:type="dxa" w:w="2412"/>
+          </w:tcPr>
+          <w:p>
+            <w:r/>
+            <w:r>
+              <w:rPr>
+                <w:sz w:val="19"/>
+              </w:rPr>
+              <w:t>The local upload fallback wrote into the project directory</w:t>
+            </w:r>
+          </w:p>
+        </w:tc>
+        <w:tc>
+          <w:tcPr>
+            <w:tcW w:type="dxa" w:w="2412"/>
+          </w:tcPr>
+          <w:p>
+            <w:r/>
+            <w:r>
+              <w:rPr>
+                <w:sz w:val="19"/>
+              </w:rPr>
+              <w:t>The Vercel build referenced files from the local file system and failed</w:t>
+            </w:r>
+          </w:p>
+        </w:tc>
+        <w:tc>
+          <w:tcPr>
+            <w:tcW w:type="dxa" w:w="2412"/>
+          </w:tcPr>
+          <w:p>
+            <w:r/>
+            <w:r>
+              <w:rPr>
+                <w:sz w:val="19"/>
+              </w:rPr>
+              <w:t>On serverless platforms the fallback writes to `/tmp`</w:t>
+            </w:r>
+          </w:p>
+        </w:tc>
+      </w:tr>
     </w:tbl>
     <w:p/>
     <w:p>
@@ -5267,15 +5441,7 @@
         <w:pStyle w:val="Heading2"/>
       </w:pPr>
       <w:r>
-        <w:t>5.2 This week — DONE</w:t>
-      </w:r>
-    </w:p>
-    <w:p>
-      <w:r>
-        <w:rPr>
-          <w:sz w:val="21"/>
-        </w:rPr>
-        <w:t>All six items of the original plan have been implemented and verified.</w:t>
+        <w:t>5.1.1 Deployment status</w:t>
       </w:r>
     </w:p>
     <w:tbl>
@@ -5301,7 +5467,7 @@
                 <w:b/>
                 <w:sz w:val="19"/>
               </w:rPr>
-              <w:t>Item</w:t>
+              <w:t>Part</w:t>
             </w:r>
           </w:p>
         </w:tc>
@@ -5331,7 +5497,7 @@
                 <w:b/>
                 <w:sz w:val="19"/>
               </w:rPr>
-              <w:t>What was built</w:t>
+              <w:t>Details</w:t>
             </w:r>
           </w:p>
         </w:tc>
@@ -5347,7 +5513,7 @@
               <w:rPr>
                 <w:sz w:val="19"/>
               </w:rPr>
-              <w:t>Exercise the billing flow end to end</w:t>
+              <w:t>Convex backend</w:t>
             </w:r>
           </w:p>
         </w:tc>
@@ -5361,7 +5527,7 @@
               <w:rPr>
                 <w:sz w:val="19"/>
               </w:rPr>
-              <w:t>DONE</w:t>
+              <w:t>DEPLOYED</w:t>
             </w:r>
           </w:p>
         </w:tc>
@@ -5375,7 +5541,7 @@
               <w:rPr>
                 <w:sz w:val="19"/>
               </w:rPr>
-              <w:t>The pricing engine, checkout, promos, tax, proration, renewals and payment methods are covered by 14 backend tests and verified live on the deployment</w:t>
+              <w:t>The production deployment `impartial-nightingale-31` runs the functions and the schema (18 tables). The demo self-check passes on it.</w:t>
             </w:r>
           </w:p>
         </w:tc>
@@ -5391,7 +5557,7 @@
               <w:rPr>
                 <w:sz w:val="19"/>
               </w:rPr>
-              <w:t>Seed a demo workspace</w:t>
+              <w:t>Web app</w:t>
             </w:r>
           </w:p>
         </w:tc>
@@ -5405,7 +5571,7 @@
               <w:rPr>
                 <w:sz w:val="19"/>
               </w:rPr>
-              <w:t>DONE</w:t>
+              <w:t>READY</w:t>
             </w:r>
           </w:p>
         </w:tc>
@@ -5419,7 +5585,7 @@
               <w:rPr>
                 <w:sz w:val="19"/>
               </w:rPr>
-              <w:t>`convex/demo.ts` — `demo:seed`, `demo:reset` and `demo:smoke`, protected by the `JOTION_DEMO_KEY` secret</w:t>
+              <w:t>`vercel.json`, `.vercelignore` and `.env.production` are in place and the Vercel compatibility check passes. A temporary preview deployment was created to validate the build; a permanent deployment needs the Vercel account (see below).</w:t>
             </w:r>
           </w:p>
         </w:tc>
@@ -5435,7 +5601,7 @@
               <w:rPr>
                 <w:sz w:val="19"/>
               </w:rPr>
-              <w:t>Clerk integration</w:t>
+              <w:t>GitHub</w:t>
             </w:r>
           </w:p>
         </w:tc>
@@ -5449,7 +5615,7 @@
               <w:rPr>
                 <w:sz w:val="19"/>
               </w:rPr>
-              <w:t>DONE</w:t>
+              <w:t>PUSHED</w:t>
             </w:r>
           </w:p>
         </w:tc>
@@ -5463,183 +5629,7 @@
               <w:rPr>
                 <w:sz w:val="19"/>
               </w:rPr>
-              <w:t>Upgraded to `@clerk/clerk-react` 5.61 — the `sessionClaims` type now matches Convex 1.47 and the cast in `convex-provider.tsx` is gone</w:t>
-            </w:r>
-          </w:p>
-        </w:tc>
-      </w:tr>
-      <w:tr>
-        <w:tc>
-          <w:tcPr>
-            <w:tcW w:type="dxa" w:w="3216"/>
-          </w:tcPr>
-          <w:p>
-            <w:r/>
-            <w:r>
-              <w:rPr>
-                <w:sz w:val="19"/>
-              </w:rPr>
-              <w:t>E-mail notifications</w:t>
-            </w:r>
-          </w:p>
-        </w:tc>
-        <w:tc>
-          <w:tcPr>
-            <w:tcW w:type="dxa" w:w="3216"/>
-          </w:tcPr>
-          <w:p>
-            <w:r/>
-            <w:r>
-              <w:rPr>
-                <w:sz w:val="19"/>
-              </w:rPr>
-              <w:t>DONE</w:t>
-            </w:r>
-          </w:p>
-        </w:tc>
-        <w:tc>
-          <w:tcPr>
-            <w:tcW w:type="dxa" w:w="3216"/>
-          </w:tcPr>
-          <w:p>
-            <w:r/>
-            <w:r>
-              <w:rPr>
-                <w:sz w:val="19"/>
-              </w:rPr>
-              <w:t>`lib/mailer.ts` + the internal `mail:send` action; mentions, invitations and invoices are e-mailed through Resend (or logged when no API key is set)</w:t>
-            </w:r>
-          </w:p>
-        </w:tc>
-      </w:tr>
-      <w:tr>
-        <w:tc>
-          <w:tcPr>
-            <w:tcW w:type="dxa" w:w="3216"/>
-          </w:tcPr>
-          <w:p>
-            <w:r/>
-            <w:r>
-              <w:rPr>
-                <w:sz w:val="19"/>
-              </w:rPr>
-              <w:t>Audit-log pagination</w:t>
-            </w:r>
-          </w:p>
-        </w:tc>
-        <w:tc>
-          <w:tcPr>
-            <w:tcW w:type="dxa" w:w="3216"/>
-          </w:tcPr>
-          <w:p>
-            <w:r/>
-            <w:r>
-              <w:rPr>
-                <w:sz w:val="19"/>
-              </w:rPr>
-              <w:t>DONE</w:t>
-            </w:r>
-          </w:p>
-        </w:tc>
-        <w:tc>
-          <w:tcPr>
-            <w:tcW w:type="dxa" w:w="3216"/>
-          </w:tcPr>
-          <w:p>
-            <w:r/>
-            <w:r>
-              <w:rPr>
-                <w:sz w:val="19"/>
-              </w:rPr>
-              <w:t>`activity:auditLogPaginated` with Convex cursor pagination and a *Load more* button in Settings → Activity</w:t>
-            </w:r>
-          </w:p>
-        </w:tc>
-      </w:tr>
-      <w:tr>
-        <w:tc>
-          <w:tcPr>
-            <w:tcW w:type="dxa" w:w="3216"/>
-          </w:tcPr>
-          <w:p>
-            <w:r/>
-            <w:r>
-              <w:rPr>
-                <w:sz w:val="19"/>
-              </w:rPr>
-              <w:t>Error boundaries per route</w:t>
-            </w:r>
-          </w:p>
-        </w:tc>
-        <w:tc>
-          <w:tcPr>
-            <w:tcW w:type="dxa" w:w="3216"/>
-          </w:tcPr>
-          <w:p>
-            <w:r/>
-            <w:r>
-              <w:rPr>
-                <w:sz w:val="19"/>
-              </w:rPr>
-              <w:t>DONE</w:t>
-            </w:r>
-          </w:p>
-        </w:tc>
-        <w:tc>
-          <w:tcPr>
-            <w:tcW w:type="dxa" w:w="3216"/>
-          </w:tcPr>
-          <w:p>
-            <w:r/>
-            <w:r>
-              <w:rPr>
-                <w:sz w:val="19"/>
-              </w:rPr>
-              <w:t>`app/(main)/error.tsx` (workspace shell) and `app/global-error.tsx` (whole document)</w:t>
-            </w:r>
-          </w:p>
-        </w:tc>
-      </w:tr>
-      <w:tr>
-        <w:tc>
-          <w:tcPr>
-            <w:tcW w:type="dxa" w:w="3216"/>
-          </w:tcPr>
-          <w:p>
-            <w:r/>
-            <w:r>
-              <w:rPr>
-                <w:sz w:val="19"/>
-              </w:rPr>
-              <w:t>Private pages (advertised but not enforced)</w:t>
-            </w:r>
-          </w:p>
-        </w:tc>
-        <w:tc>
-          <w:tcPr>
-            <w:tcW w:type="dxa" w:w="3216"/>
-          </w:tcPr>
-          <w:p>
-            <w:r/>
-            <w:r>
-              <w:rPr>
-                <w:sz w:val="19"/>
-              </w:rPr>
-              <w:t>DONE</w:t>
-            </w:r>
-          </w:p>
-        </w:tc>
-        <w:tc>
-          <w:tcPr>
-            <w:tcW w:type="dxa" w:w="3216"/>
-          </w:tcPr>
-          <w:p>
-            <w:r/>
-            <w:r>
-              <w:rPr>
-                <w:sz w:val="19"/>
-              </w:rPr>
-              <w:t>`isPrivate` on documents, enforced on the server, blocked on the Free plan, with a toggle in the page menu</w:t>
+              <w:t>Every commit is on the `v2` branch of the repository; the CI workflow runs the full verification on every push.</w:t>
             </w:r>
           </w:p>
         </w:tc>
@@ -5647,200 +5637,156 @@
     </w:tbl>
     <w:p/>
     <w:p>
-      <w:pPr>
-        <w:pStyle w:val="Heading2"/>
-      </w:pPr>
-      <w:r>
-        <w:t>5.2.1 How to use the demo helpers</w:t>
+      <w:r>
+        <w:rPr>
+          <w:b/>
+          <w:sz w:val="21"/>
+        </w:rPr>
+        <w:t>The three manual steps</w:t>
+      </w:r>
+      <w:r>
+        <w:rPr>
+          <w:sz w:val="21"/>
+        </w:rPr>
+        <w:t xml:space="preserve"> (they need your accounts):</w:t>
       </w:r>
     </w:p>
     <w:p>
       <w:pPr>
-        <w:spacing w:after="0" w:before="0" w:line="240" w:lineRule="auto"/>
+        <w:pStyle w:val="ListNumber"/>
+        <w:spacing w:after="40"/>
+        <w:ind w:left="432"/>
       </w:pPr>
       <w:r>
         <w:rPr>
-          <w:rFonts w:ascii="Consolas" w:hAnsi="Consolas" w:eastAsia="Consolas"/>
-          <w:sz w:val="15"/>
+          <w:b/>
+          <w:sz w:val="21"/>
         </w:rPr>
-        <w:t># one-off: create the secret (and keep it out of the repository)</w:t>
-      </w:r>
-    </w:p>
-    <w:p>
-      <w:pPr>
-        <w:spacing w:after="0" w:before="0" w:line="240" w:lineRule="auto"/>
-      </w:pPr>
-      <w:r>
-        <w:rPr>
-          <w:rFonts w:ascii="Consolas" w:hAnsi="Consolas" w:eastAsia="Consolas"/>
-          <w:sz w:val="15"/>
-        </w:rPr>
-        <w:t>npx convex env set JOTION_DEMO_KEY "$(openssl rand -hex 16)"</w:t>
-      </w:r>
-    </w:p>
-    <w:p>
-      <w:pPr>
-        <w:spacing w:after="0" w:before="0" w:line="240" w:lineRule="auto"/>
-      </w:pPr>
-      <w:r>
-        <w:rPr>
-          <w:rFonts w:ascii="Consolas" w:hAnsi="Consolas" w:eastAsia="Consolas"/>
-          <w:sz w:val="15"/>
-        </w:rPr>
-        <w:t xml:space="preserve"> </w:t>
-      </w:r>
-    </w:p>
-    <w:p>
-      <w:pPr>
-        <w:spacing w:after="0" w:before="0" w:line="240" w:lineRule="auto"/>
-      </w:pPr>
-      <w:r>
-        <w:rPr>
-          <w:rFonts w:ascii="Consolas" w:hAnsi="Consolas" w:eastAsia="Consolas"/>
-          <w:sz w:val="15"/>
-        </w:rPr>
-        <w:t># read the key back</w:t>
-      </w:r>
-    </w:p>
-    <w:p>
-      <w:pPr>
-        <w:spacing w:after="0" w:before="0" w:line="240" w:lineRule="auto"/>
-      </w:pPr>
-      <w:r>
-        <w:rPr>
-          <w:rFonts w:ascii="Consolas" w:hAnsi="Consolas" w:eastAsia="Consolas"/>
-          <w:sz w:val="15"/>
-        </w:rPr>
-        <w:t>npx convex env get JOTION_DEMO_KEY</w:t>
-      </w:r>
-    </w:p>
-    <w:p>
-      <w:pPr>
-        <w:spacing w:after="0" w:before="0" w:line="240" w:lineRule="auto"/>
-      </w:pPr>
-      <w:r>
-        <w:rPr>
-          <w:rFonts w:ascii="Consolas" w:hAnsi="Consolas" w:eastAsia="Consolas"/>
-          <w:sz w:val="15"/>
-        </w:rPr>
-        <w:t xml:space="preserve"> </w:t>
-      </w:r>
-    </w:p>
-    <w:p>
-      <w:pPr>
-        <w:spacing w:after="0" w:before="0" w:line="240" w:lineRule="auto"/>
-      </w:pPr>
-      <w:r>
-        <w:rPr>
-          <w:rFonts w:ascii="Consolas" w:hAnsi="Consolas" w:eastAsia="Consolas"/>
-          <w:sz w:val="15"/>
-        </w:rPr>
-        <w:t># seed a demo workspace (owned by a Clerk user id)</w:t>
-      </w:r>
-    </w:p>
-    <w:p>
-      <w:pPr>
-        <w:spacing w:after="0" w:before="0" w:line="240" w:lineRule="auto"/>
-      </w:pPr>
-      <w:r>
-        <w:rPr>
-          <w:rFonts w:ascii="Consolas" w:hAnsi="Consolas" w:eastAsia="Consolas"/>
-          <w:sz w:val="15"/>
-        </w:rPr>
-        <w:t>npx convex run demo:seed '{"key":"&lt;KEY&gt;","userId":"&lt;clerk_user_id&gt;"}'</w:t>
-      </w:r>
-    </w:p>
-    <w:p>
-      <w:pPr>
-        <w:spacing w:after="0" w:before="0" w:line="240" w:lineRule="auto"/>
-      </w:pPr>
-      <w:r>
-        <w:rPr>
-          <w:rFonts w:ascii="Consolas" w:hAnsi="Consolas" w:eastAsia="Consolas"/>
-          <w:sz w:val="15"/>
-        </w:rPr>
-        <w:t xml:space="preserve"> </w:t>
-      </w:r>
-    </w:p>
-    <w:p>
-      <w:pPr>
-        <w:spacing w:after="0" w:before="0" w:line="240" w:lineRule="auto"/>
-      </w:pPr>
-      <w:r>
-        <w:rPr>
-          <w:rFonts w:ascii="Consolas" w:hAnsi="Consolas" w:eastAsia="Consolas"/>
-          <w:sz w:val="15"/>
-        </w:rPr>
-        <w:t># self-check the deployment (pricing, formulas, limits)</w:t>
-      </w:r>
-    </w:p>
-    <w:p>
-      <w:pPr>
-        <w:spacing w:after="0" w:before="0" w:line="240" w:lineRule="auto"/>
-      </w:pPr>
-      <w:r>
-        <w:rPr>
-          <w:rFonts w:ascii="Consolas" w:hAnsi="Consolas" w:eastAsia="Consolas"/>
-          <w:sz w:val="15"/>
-        </w:rPr>
-        <w:t>npx convex run demo:smoke '{"key":"&lt;KEY&gt;"}'</w:t>
-      </w:r>
-    </w:p>
-    <w:p>
-      <w:pPr>
-        <w:spacing w:after="0" w:before="0" w:line="240" w:lineRule="auto"/>
-      </w:pPr>
-      <w:r>
-        <w:rPr>
-          <w:rFonts w:ascii="Consolas" w:hAnsi="Consolas" w:eastAsia="Consolas"/>
-          <w:sz w:val="15"/>
-        </w:rPr>
-        <w:t xml:space="preserve"> </w:t>
-      </w:r>
-    </w:p>
-    <w:p>
-      <w:pPr>
-        <w:spacing w:after="0" w:before="0" w:line="240" w:lineRule="auto"/>
-      </w:pPr>
-      <w:r>
-        <w:rPr>
-          <w:rFonts w:ascii="Consolas" w:hAnsi="Consolas" w:eastAsia="Consolas"/>
-          <w:sz w:val="15"/>
-        </w:rPr>
-        <w:t># clean up again</w:t>
-      </w:r>
-    </w:p>
-    <w:p>
-      <w:pPr>
-        <w:spacing w:after="0" w:before="0" w:line="240" w:lineRule="auto"/>
-      </w:pPr>
-      <w:r>
-        <w:rPr>
-          <w:rFonts w:ascii="Consolas" w:hAnsi="Consolas" w:eastAsia="Consolas"/>
-          <w:sz w:val="15"/>
-        </w:rPr>
-        <w:t>npx convex run demo:reset '{"key":"&lt;KEY&gt;"}'</w:t>
-      </w:r>
-    </w:p>
-    <w:p>
+        <w:t>Clerk</w:t>
+      </w:r>
       <w:r>
         <w:rPr>
           <w:sz w:val="21"/>
         </w:rPr>
-        <w:t xml:space="preserve">The helpers refuse to run when </w:t>
+        <w:t xml:space="preserve"> — copy the publishable key of your production instance and add it to the Vercel project as </w:t>
       </w:r>
       <w:r>
         <w:rPr>
           <w:rFonts w:ascii="Consolas" w:hAnsi="Consolas"/>
           <w:sz w:val="19"/>
         </w:rPr>
-        <w:t>JOTION_DEMO_KEY</w:t>
+        <w:t>NEXT_PUBLIC_CLERK_PUBLISHABLE_KEY</w:t>
       </w:r>
       <w:r>
         <w:rPr>
           <w:sz w:val="21"/>
         </w:rPr>
-        <w:t xml:space="preserve"> is not configured, so they are inert on a deployment where the secret is missing.</w:t>
+        <w:t>. Without it the app shows a setup screen instead of crashing.</w:t>
+      </w:r>
+    </w:p>
+    <w:p>
+      <w:pPr>
+        <w:pStyle w:val="ListNumber"/>
+        <w:spacing w:after="40"/>
+        <w:ind w:left="432"/>
+      </w:pPr>
+      <w:r>
+        <w:rPr>
+          <w:b/>
+          <w:sz w:val="21"/>
+        </w:rPr>
+        <w:t>Vercel</w:t>
+      </w:r>
+      <w:r>
+        <w:rPr>
+          <w:sz w:val="21"/>
+        </w:rPr>
+        <w:t xml:space="preserve"> — </w:t>
+      </w:r>
+      <w:r>
+        <w:rPr>
+          <w:rFonts w:ascii="Consolas" w:hAnsi="Consolas"/>
+          <w:sz w:val="19"/>
+        </w:rPr>
+        <w:t>npx vercel login &amp;&amp; npx vercel link</w:t>
+      </w:r>
+      <w:r>
+        <w:rPr>
+          <w:sz w:val="21"/>
+        </w:rPr>
+        <w:t xml:space="preserve">, add the two environment variables and run </w:t>
+      </w:r>
+      <w:r>
+        <w:rPr>
+          <w:rFonts w:ascii="Consolas" w:hAnsi="Consolas"/>
+          <w:sz w:val="19"/>
+        </w:rPr>
+        <w:t>npx vercel --prod</w:t>
+      </w:r>
+      <w:r>
+        <w:rPr>
+          <w:sz w:val="21"/>
+        </w:rPr>
+        <w:t xml:space="preserve"> (or install the Vercel GitHub app and let every push deploy).</w:t>
+      </w:r>
+    </w:p>
+    <w:p>
+      <w:pPr>
+        <w:pStyle w:val="ListNumber"/>
+        <w:spacing w:after="40"/>
+        <w:ind w:left="432"/>
+      </w:pPr>
+      <w:r>
+        <w:rPr>
+          <w:b/>
+          <w:sz w:val="21"/>
+        </w:rPr>
+        <w:t>Storage (optional)</w:t>
+      </w:r>
+      <w:r>
+        <w:rPr>
+          <w:sz w:val="21"/>
+        </w:rPr>
+        <w:t xml:space="preserve"> — add </w:t>
+      </w:r>
+      <w:r>
+        <w:rPr>
+          <w:rFonts w:ascii="Consolas" w:hAnsi="Consolas"/>
+          <w:sz w:val="19"/>
+        </w:rPr>
+        <w:t>EDGE_STORE_ACCESS_KEY</w:t>
+      </w:r>
+      <w:r>
+        <w:rPr>
+          <w:sz w:val="21"/>
+        </w:rPr>
+        <w:t xml:space="preserve"> and </w:t>
+      </w:r>
+      <w:r>
+        <w:rPr>
+          <w:rFonts w:ascii="Consolas" w:hAnsi="Consolas"/>
+          <w:sz w:val="19"/>
+        </w:rPr>
+        <w:t>EDGE_STORE_SECRET_KEY</w:t>
+      </w:r>
+      <w:r>
+        <w:rPr>
+          <w:sz w:val="21"/>
+        </w:rPr>
+        <w:t xml:space="preserve"> so that uploads are durable; without them the local fallback writes to </w:t>
+      </w:r>
+      <w:r>
+        <w:rPr>
+          <w:rFonts w:ascii="Consolas" w:hAnsi="Consolas"/>
+          <w:sz w:val="19"/>
+        </w:rPr>
+        <w:t>/tmp</w:t>
+      </w:r>
+      <w:r>
+        <w:rPr>
+          <w:sz w:val="21"/>
+        </w:rPr>
+        <w:t>, which is wiped on every serverless instance.</w:t>
       </w:r>
     </w:p>
     <w:p>
@@ -5848,7 +5794,15 @@
         <w:pStyle w:val="Heading2"/>
       </w:pPr>
       <w:r>
-        <w:t>5.3 The backlog — what is done and what is left</w:t>
+        <w:t>5.2 This week — DONE</w:t>
+      </w:r>
+    </w:p>
+    <w:p>
+      <w:r>
+        <w:rPr>
+          <w:sz w:val="21"/>
+        </w:rPr>
+        <w:t>All six items of the original plan have been implemented and verified.</w:t>
       </w:r>
     </w:p>
     <w:tbl>
@@ -5874,7 +5828,7 @@
                 <w:b/>
                 <w:sz w:val="19"/>
               </w:rPr>
-              <w:t>Feature</w:t>
+              <w:t>Item</w:t>
             </w:r>
           </w:p>
         </w:tc>
@@ -5904,7 +5858,7 @@
                 <w:b/>
                 <w:sz w:val="19"/>
               </w:rPr>
-              <w:t>Notes</w:t>
+              <w:t>What was built</w:t>
             </w:r>
           </w:p>
         </w:tc>
@@ -5920,7 +5874,7 @@
               <w:rPr>
                 <w:sz w:val="19"/>
               </w:rPr>
-              <w:t>Real-time collaboration</w:t>
+              <w:t>Exercise the billing flow end to end</w:t>
             </w:r>
           </w:p>
         </w:tc>
@@ -5948,7 +5902,7 @@
               <w:rPr>
                 <w:sz w:val="19"/>
               </w:rPr>
-              <w:t>Yjs CRDT synced through Convex, presence in the header, convergence tested</w:t>
+              <w:t>The pricing engine, checkout, promos, tax, proration, renewals and payment methods are covered by 14 backend tests and verified live on the deployment</w:t>
             </w:r>
           </w:p>
         </w:tc>
@@ -5964,7 +5918,7 @@
               <w:rPr>
                 <w:sz w:val="19"/>
               </w:rPr>
-              <w:t>Relations &amp; rollups</w:t>
+              <w:t>Seed a demo workspace</w:t>
             </w:r>
           </w:p>
         </w:tc>
@@ -5992,7 +5946,7 @@
               <w:rPr>
                 <w:sz w:val="19"/>
               </w:rPr>
-              <w:t>Cross-database links with count/sum/avg/min/max/list rollups</w:t>
+              <w:t>`convex/demo.ts` — `demo:seed`, `demo:reset` and `demo:smoke`, protected by the `JOTION_DEMO_KEY` secret</w:t>
             </w:r>
           </w:p>
         </w:tc>
@@ -6008,7 +5962,7 @@
               <w:rPr>
                 <w:sz w:val="19"/>
               </w:rPr>
-              <w:t>Synced blocks</w:t>
+              <w:t>Clerk integration</w:t>
             </w:r>
           </w:p>
         </w:tc>
@@ -6036,7 +5990,7 @@
               <w:rPr>
                 <w:sz w:val="19"/>
               </w:rPr>
-              <w:t>A page mirrors the content of another one and updates automatically</w:t>
+              <w:t>Upgraded to `@clerk/clerk-react` 5.61 — the `sessionClaims` type now matches Convex 1.47 and the cast in `convex-provider.tsx` is gone</w:t>
             </w:r>
           </w:p>
         </w:tc>
@@ -6052,7 +6006,7 @@
               <w:rPr>
                 <w:sz w:val="19"/>
               </w:rPr>
-              <w:t>Automations</w:t>
+              <w:t>E-mail notifications</w:t>
             </w:r>
           </w:p>
         </w:tc>
@@ -6080,7 +6034,7 @@
               <w:rPr>
                 <w:sz w:val="19"/>
               </w:rPr>
-              <w:t>Trigger → set a property / notify the team, limited by the plan</w:t>
+              <w:t>`lib/mailer.ts` + the internal `mail:send` action; mentions, invitations and invoices are e-mailed through Resend (or logged when no API key is set)</w:t>
             </w:r>
           </w:p>
         </w:tc>
@@ -6096,7 +6050,7 @@
               <w:rPr>
                 <w:sz w:val="19"/>
               </w:rPr>
-              <w:t>Import (Markdown / CSV / Notion export)</w:t>
+              <w:t>Audit-log pagination</w:t>
             </w:r>
           </w:p>
         </w:tc>
@@ -6124,7 +6078,7 @@
               <w:rPr>
                 <w:sz w:val="19"/>
               </w:rPr>
-              <w:t>All three import paths work</w:t>
+              <w:t>`activity:auditLogPaginated` with Convex cursor pagination and a *Load more* button in Settings → Activity</w:t>
             </w:r>
           </w:p>
         </w:tc>
@@ -6140,7 +6094,7 @@
               <w:rPr>
                 <w:sz w:val="19"/>
               </w:rPr>
-              <w:t>Templates with properties &amp; database presets</w:t>
+              <w:t>Error boundaries per route</w:t>
             </w:r>
           </w:p>
         </w:tc>
@@ -6168,7 +6122,7 @@
               <w:rPr>
                 <w:sz w:val="19"/>
               </w:rPr>
-              <w:t>Templates carry properties, columns and views</w:t>
+              <w:t>`app/(main)/error.tsx` (workspace shell) and `app/global-error.tsx` (whole document)</w:t>
             </w:r>
           </w:p>
         </w:tc>
@@ -6184,7 +6138,7 @@
               <w:rPr>
                 <w:sz w:val="19"/>
               </w:rPr>
-              <w:t>AI writing assistant</w:t>
+              <w:t>Private pages (advertised but not enforced)</w:t>
             </w:r>
           </w:p>
         </w:tc>
@@ -6212,271 +6166,7 @@
               <w:rPr>
                 <w:sz w:val="19"/>
               </w:rPr>
-              <w:t>Improve, shorten, summarize, continue, translate — pluggable provider</w:t>
-            </w:r>
-          </w:p>
-        </w:tc>
-      </w:tr>
-      <w:tr>
-        <w:tc>
-          <w:tcPr>
-            <w:tcW w:type="dxa" w:w="3216"/>
-          </w:tcPr>
-          <w:p>
-            <w:r/>
-            <w:r>
-              <w:rPr>
-                <w:sz w:val="19"/>
-              </w:rPr>
-              <w:t>Slack / Google Drive / GitHub integrations</w:t>
-            </w:r>
-          </w:p>
-        </w:tc>
-        <w:tc>
-          <w:tcPr>
-            <w:tcW w:type="dxa" w:w="3216"/>
-          </w:tcPr>
-          <w:p>
-            <w:r/>
-            <w:r>
-              <w:rPr>
-                <w:sz w:val="19"/>
-              </w:rPr>
-              <w:t>OPEN</w:t>
-            </w:r>
-          </w:p>
-        </w:tc>
-        <w:tc>
-          <w:tcPr>
-            <w:tcW w:type="dxa" w:w="3216"/>
-          </w:tcPr>
-          <w:p>
-            <w:r/>
-            <w:r>
-              <w:rPr>
-                <w:sz w:val="19"/>
-              </w:rPr>
-              <w:t>Needs third-party OAuth and webhooks</w:t>
-            </w:r>
-          </w:p>
-        </w:tc>
-      </w:tr>
-      <w:tr>
-        <w:tc>
-          <w:tcPr>
-            <w:tcW w:type="dxa" w:w="3216"/>
-          </w:tcPr>
-          <w:p>
-            <w:r/>
-            <w:r>
-              <w:rPr>
-                <w:sz w:val="19"/>
-              </w:rPr>
-              <w:t>Mobile apps</w:t>
-            </w:r>
-          </w:p>
-        </w:tc>
-        <w:tc>
-          <w:tcPr>
-            <w:tcW w:type="dxa" w:w="3216"/>
-          </w:tcPr>
-          <w:p>
-            <w:r/>
-            <w:r>
-              <w:rPr>
-                <w:sz w:val="19"/>
-              </w:rPr>
-              <w:t>OPEN</w:t>
-            </w:r>
-          </w:p>
-        </w:tc>
-        <w:tc>
-          <w:tcPr>
-            <w:tcW w:type="dxa" w:w="3216"/>
-          </w:tcPr>
-          <w:p>
-            <w:r/>
-            <w:r>
-              <w:rPr>
-                <w:sz w:val="19"/>
-              </w:rPr>
-              <w:t>A React Native shell on top of the existing API</w:t>
-            </w:r>
-          </w:p>
-        </w:tc>
-      </w:tr>
-      <w:tr>
-        <w:tc>
-          <w:tcPr>
-            <w:tcW w:type="dxa" w:w="3216"/>
-          </w:tcPr>
-          <w:p>
-            <w:r/>
-            <w:r>
-              <w:rPr>
-                <w:sz w:val="19"/>
-              </w:rPr>
-              <w:t>Offline support</w:t>
-            </w:r>
-          </w:p>
-        </w:tc>
-        <w:tc>
-          <w:tcPr>
-            <w:tcW w:type="dxa" w:w="3216"/>
-          </w:tcPr>
-          <w:p>
-            <w:r/>
-            <w:r>
-              <w:rPr>
-                <w:sz w:val="19"/>
-              </w:rPr>
-              <w:t>OPEN</w:t>
-            </w:r>
-          </w:p>
-        </w:tc>
-        <w:tc>
-          <w:tcPr>
-            <w:tcW w:type="dxa" w:w="3216"/>
-          </w:tcPr>
-          <w:p>
-            <w:r/>
-            <w:r>
-              <w:rPr>
-                <w:sz w:val="19"/>
-              </w:rPr>
-              <w:t>Local cache and conflict resolution</w:t>
-            </w:r>
-          </w:p>
-        </w:tc>
-      </w:tr>
-      <w:tr>
-        <w:tc>
-          <w:tcPr>
-            <w:tcW w:type="dxa" w:w="3216"/>
-          </w:tcPr>
-          <w:p>
-            <w:r/>
-            <w:r>
-              <w:rPr>
-                <w:sz w:val="19"/>
-              </w:rPr>
-              <w:t>Public pages with comments</w:t>
-            </w:r>
-          </w:p>
-        </w:tc>
-        <w:tc>
-          <w:tcPr>
-            <w:tcW w:type="dxa" w:w="3216"/>
-          </w:tcPr>
-          <w:p>
-            <w:r/>
-            <w:r>
-              <w:rPr>
-                <w:sz w:val="19"/>
-              </w:rPr>
-              <w:t>OPEN</w:t>
-            </w:r>
-          </w:p>
-        </w:tc>
-        <w:tc>
-          <w:tcPr>
-            <w:tcW w:type="dxa" w:w="3216"/>
-          </w:tcPr>
-          <w:p>
-            <w:r/>
-            <w:r>
-              <w:rPr>
-                <w:sz w:val="19"/>
-              </w:rPr>
-              <w:t>Comments on published pages for anonymous visitors</w:t>
-            </w:r>
-          </w:p>
-        </w:tc>
-      </w:tr>
-      <w:tr>
-        <w:tc>
-          <w:tcPr>
-            <w:tcW w:type="dxa" w:w="3216"/>
-          </w:tcPr>
-          <w:p>
-            <w:r/>
-            <w:r>
-              <w:rPr>
-                <w:sz w:val="19"/>
-              </w:rPr>
-              <w:t>Per-database permissions / private teamspaces</w:t>
-            </w:r>
-          </w:p>
-        </w:tc>
-        <w:tc>
-          <w:tcPr>
-            <w:tcW w:type="dxa" w:w="3216"/>
-          </w:tcPr>
-          <w:p>
-            <w:r/>
-            <w:r>
-              <w:rPr>
-                <w:sz w:val="19"/>
-              </w:rPr>
-              <w:t>OPEN</w:t>
-            </w:r>
-          </w:p>
-        </w:tc>
-        <w:tc>
-          <w:tcPr>
-            <w:tcW w:type="dxa" w:w="3216"/>
-          </w:tcPr>
-          <w:p>
-            <w:r/>
-            <w:r>
-              <w:rPr>
-                <w:sz w:val="19"/>
-              </w:rPr>
-              <w:t>Finer grained access control</w:t>
-            </w:r>
-          </w:p>
-        </w:tc>
-      </w:tr>
-      <w:tr>
-        <w:tc>
-          <w:tcPr>
-            <w:tcW w:type="dxa" w:w="3216"/>
-          </w:tcPr>
-          <w:p>
-            <w:r/>
-            <w:r>
-              <w:rPr>
-                <w:sz w:val="19"/>
-              </w:rPr>
-              <w:t>Real payment processing</w:t>
-            </w:r>
-          </w:p>
-        </w:tc>
-        <w:tc>
-          <w:tcPr>
-            <w:tcW w:type="dxa" w:w="3216"/>
-          </w:tcPr>
-          <w:p>
-            <w:r/>
-            <w:r>
-              <w:rPr>
-                <w:sz w:val="19"/>
-              </w:rPr>
-              <w:t>OPEN</w:t>
-            </w:r>
-          </w:p>
-        </w:tc>
-        <w:tc>
-          <w:tcPr>
-            <w:tcW w:type="dxa" w:w="3216"/>
-          </w:tcPr>
-          <w:p>
-            <w:r/>
-            <w:r>
-              <w:rPr>
-                <w:sz w:val="19"/>
-              </w:rPr>
-              <w:t>Replace the demo checkout with Stripe</w:t>
+              <w:t>`isPrivate` on documents, enforced on the server, blocked on the Free plan, with a toggle in the page menu</w:t>
             </w:r>
           </w:p>
         </w:tc>
@@ -6488,67 +6178,204 @@
         <w:pStyle w:val="Heading2"/>
       </w:pPr>
       <w:r>
-        <w:t>5.4 Later</w:t>
+        <w:t>5.2.1 How to use the demo helpers</w:t>
       </w:r>
     </w:p>
     <w:p>
       <w:pPr>
-        <w:pStyle w:val="ListBullet"/>
-        <w:spacing w:after="40"/>
-        <w:ind w:left="432"/>
+        <w:spacing w:after="0" w:before="0" w:line="240" w:lineRule="auto"/>
       </w:pPr>
+      <w:r>
+        <w:rPr>
+          <w:rFonts w:ascii="Consolas" w:hAnsi="Consolas" w:eastAsia="Consolas"/>
+          <w:sz w:val="15"/>
+        </w:rPr>
+        <w:t># one-off: create the secret (and keep it out of the repository)</w:t>
+      </w:r>
+    </w:p>
+    <w:p>
+      <w:pPr>
+        <w:spacing w:after="0" w:before="0" w:line="240" w:lineRule="auto"/>
+      </w:pPr>
+      <w:r>
+        <w:rPr>
+          <w:rFonts w:ascii="Consolas" w:hAnsi="Consolas" w:eastAsia="Consolas"/>
+          <w:sz w:val="15"/>
+        </w:rPr>
+        <w:t>npx convex env set JOTION_DEMO_KEY "$(openssl rand -hex 16)"</w:t>
+      </w:r>
+    </w:p>
+    <w:p>
+      <w:pPr>
+        <w:spacing w:after="0" w:before="0" w:line="240" w:lineRule="auto"/>
+      </w:pPr>
+      <w:r>
+        <w:rPr>
+          <w:rFonts w:ascii="Consolas" w:hAnsi="Consolas" w:eastAsia="Consolas"/>
+          <w:sz w:val="15"/>
+        </w:rPr>
+        <w:t xml:space="preserve"> </w:t>
+      </w:r>
+    </w:p>
+    <w:p>
+      <w:pPr>
+        <w:spacing w:after="0" w:before="0" w:line="240" w:lineRule="auto"/>
+      </w:pPr>
+      <w:r>
+        <w:rPr>
+          <w:rFonts w:ascii="Consolas" w:hAnsi="Consolas" w:eastAsia="Consolas"/>
+          <w:sz w:val="15"/>
+        </w:rPr>
+        <w:t># read the key back</w:t>
+      </w:r>
+    </w:p>
+    <w:p>
+      <w:pPr>
+        <w:spacing w:after="0" w:before="0" w:line="240" w:lineRule="auto"/>
+      </w:pPr>
+      <w:r>
+        <w:rPr>
+          <w:rFonts w:ascii="Consolas" w:hAnsi="Consolas" w:eastAsia="Consolas"/>
+          <w:sz w:val="15"/>
+        </w:rPr>
+        <w:t>npx convex env get JOTION_DEMO_KEY</w:t>
+      </w:r>
+    </w:p>
+    <w:p>
+      <w:pPr>
+        <w:spacing w:after="0" w:before="0" w:line="240" w:lineRule="auto"/>
+      </w:pPr>
+      <w:r>
+        <w:rPr>
+          <w:rFonts w:ascii="Consolas" w:hAnsi="Consolas" w:eastAsia="Consolas"/>
+          <w:sz w:val="15"/>
+        </w:rPr>
+        <w:t xml:space="preserve"> </w:t>
+      </w:r>
+    </w:p>
+    <w:p>
+      <w:pPr>
+        <w:spacing w:after="0" w:before="0" w:line="240" w:lineRule="auto"/>
+      </w:pPr>
+      <w:r>
+        <w:rPr>
+          <w:rFonts w:ascii="Consolas" w:hAnsi="Consolas" w:eastAsia="Consolas"/>
+          <w:sz w:val="15"/>
+        </w:rPr>
+        <w:t># seed a demo workspace (owned by a Clerk user id)</w:t>
+      </w:r>
+    </w:p>
+    <w:p>
+      <w:pPr>
+        <w:spacing w:after="0" w:before="0" w:line="240" w:lineRule="auto"/>
+      </w:pPr>
+      <w:r>
+        <w:rPr>
+          <w:rFonts w:ascii="Consolas" w:hAnsi="Consolas" w:eastAsia="Consolas"/>
+          <w:sz w:val="15"/>
+        </w:rPr>
+        <w:t>npx convex run demo:seed '{"key":"&lt;KEY&gt;","userId":"&lt;clerk_user_id&gt;"}'</w:t>
+      </w:r>
+    </w:p>
+    <w:p>
+      <w:pPr>
+        <w:spacing w:after="0" w:before="0" w:line="240" w:lineRule="auto"/>
+      </w:pPr>
+      <w:r>
+        <w:rPr>
+          <w:rFonts w:ascii="Consolas" w:hAnsi="Consolas" w:eastAsia="Consolas"/>
+          <w:sz w:val="15"/>
+        </w:rPr>
+        <w:t xml:space="preserve"> </w:t>
+      </w:r>
+    </w:p>
+    <w:p>
+      <w:pPr>
+        <w:spacing w:after="0" w:before="0" w:line="240" w:lineRule="auto"/>
+      </w:pPr>
+      <w:r>
+        <w:rPr>
+          <w:rFonts w:ascii="Consolas" w:hAnsi="Consolas" w:eastAsia="Consolas"/>
+          <w:sz w:val="15"/>
+        </w:rPr>
+        <w:t># self-check the deployment (pricing, formulas, limits)</w:t>
+      </w:r>
+    </w:p>
+    <w:p>
+      <w:pPr>
+        <w:spacing w:after="0" w:before="0" w:line="240" w:lineRule="auto"/>
+      </w:pPr>
+      <w:r>
+        <w:rPr>
+          <w:rFonts w:ascii="Consolas" w:hAnsi="Consolas" w:eastAsia="Consolas"/>
+          <w:sz w:val="15"/>
+        </w:rPr>
+        <w:t>npx convex run demo:smoke '{"key":"&lt;KEY&gt;"}'</w:t>
+      </w:r>
+    </w:p>
+    <w:p>
+      <w:pPr>
+        <w:spacing w:after="0" w:before="0" w:line="240" w:lineRule="auto"/>
+      </w:pPr>
+      <w:r>
+        <w:rPr>
+          <w:rFonts w:ascii="Consolas" w:hAnsi="Consolas" w:eastAsia="Consolas"/>
+          <w:sz w:val="15"/>
+        </w:rPr>
+        <w:t xml:space="preserve"> </w:t>
+      </w:r>
+    </w:p>
+    <w:p>
+      <w:pPr>
+        <w:spacing w:after="0" w:before="0" w:line="240" w:lineRule="auto"/>
+      </w:pPr>
+      <w:r>
+        <w:rPr>
+          <w:rFonts w:ascii="Consolas" w:hAnsi="Consolas" w:eastAsia="Consolas"/>
+          <w:sz w:val="15"/>
+        </w:rPr>
+        <w:t># clean up again</w:t>
+      </w:r>
+    </w:p>
+    <w:p>
+      <w:pPr>
+        <w:spacing w:after="0" w:before="0" w:line="240" w:lineRule="auto"/>
+      </w:pPr>
+      <w:r>
+        <w:rPr>
+          <w:rFonts w:ascii="Consolas" w:hAnsi="Consolas" w:eastAsia="Consolas"/>
+          <w:sz w:val="15"/>
+        </w:rPr>
+        <w:t>npx convex run demo:reset '{"key":"&lt;KEY&gt;"}'</w:t>
+      </w:r>
+    </w:p>
+    <w:p>
       <w:r>
         <w:rPr>
           <w:sz w:val="21"/>
         </w:rPr>
-        <w:t>Replace the demo checkout with a real payment provider (Stripe) — the billing model is already provider-agnostic.</w:t>
+        <w:t xml:space="preserve">The helpers refuse to run when </w:t>
+      </w:r>
+      <w:r>
+        <w:rPr>
+          <w:rFonts w:ascii="Consolas" w:hAnsi="Consolas"/>
+          <w:sz w:val="19"/>
+        </w:rPr>
+        <w:t>JOTION_DEMO_KEY</w:t>
+      </w:r>
+      <w:r>
+        <w:rPr>
+          <w:sz w:val="21"/>
+        </w:rPr>
+        <w:t xml:space="preserve"> is not configured, so they are inert on a deployment where the secret is missing.</w:t>
       </w:r>
     </w:p>
     <w:p>
       <w:pPr>
-        <w:pStyle w:val="ListBullet"/>
-        <w:spacing w:after="40"/>
-        <w:ind w:left="432"/>
+        <w:pStyle w:val="Heading2"/>
       </w:pPr>
       <w:r>
-        <w:rPr>
-          <w:sz w:val="21"/>
-        </w:rPr>
-        <w:t>Multi-region data residency (the Enterprise plan advertises it).</w:t>
-      </w:r>
-    </w:p>
-    <w:p>
-      <w:pPr>
-        <w:pStyle w:val="ListBullet"/>
-        <w:spacing w:after="40"/>
-        <w:ind w:left="432"/>
-      </w:pPr>
-      <w:r>
-        <w:rPr>
-          <w:sz w:val="21"/>
-        </w:rPr>
-        <w:t>Public pages with comments and reactions.</w:t>
-      </w:r>
-    </w:p>
-    <w:p>
-      <w:pPr>
-        <w:pStyle w:val="ListBullet"/>
-        <w:spacing w:after="40"/>
-        <w:ind w:left="432"/>
-      </w:pPr>
-      <w:r>
-        <w:rPr>
-          <w:sz w:val="21"/>
-        </w:rPr>
-        <w:t>Per-database permissions and private teamspaces.</w:t>
-      </w:r>
-    </w:p>
-    <w:p>
-      <w:pPr>
-        <w:pStyle w:val="Heading1"/>
-      </w:pPr>
-      <w:r>
-        <w:t>6. Known limitations &amp; risks</w:t>
+        <w:t>5.3 The backlog — what is done and what is left</w:t>
       </w:r>
     </w:p>
     <w:tbl>
@@ -6574,7 +6401,7 @@
                 <w:b/>
                 <w:sz w:val="19"/>
               </w:rPr>
-              <w:t>Area</w:t>
+              <w:t>Feature</w:t>
             </w:r>
           </w:p>
         </w:tc>
@@ -6589,7 +6416,7 @@
                 <w:b/>
                 <w:sz w:val="19"/>
               </w:rPr>
-              <w:t>Limitation</w:t>
+              <w:t>Status</w:t>
             </w:r>
           </w:p>
         </w:tc>
@@ -6604,7 +6431,7 @@
                 <w:b/>
                 <w:sz w:val="19"/>
               </w:rPr>
-              <w:t>Risk</w:t>
+              <w:t>Notes</w:t>
             </w:r>
           </w:p>
         </w:tc>
@@ -6620,7 +6447,7 @@
               <w:rPr>
                 <w:sz w:val="19"/>
               </w:rPr>
-              <w:t>Payments</w:t>
+              <w:t>Real-time collaboration</w:t>
             </w:r>
           </w:p>
         </w:tc>
@@ -6634,7 +6461,7 @@
               <w:rPr>
                 <w:sz w:val="19"/>
               </w:rPr>
-              <w:t>The card form is a demo — no real processor is connected</w:t>
+              <w:t>DONE</w:t>
             </w:r>
           </w:p>
         </w:tc>
@@ -6648,7 +6475,7 @@
               <w:rPr>
                 <w:sz w:val="19"/>
               </w:rPr>
-              <w:t>Medium — do not market as paid</w:t>
+              <w:t>Yjs CRDT synced through Convex, presence in the header, convergence tested</w:t>
             </w:r>
           </w:p>
         </w:tc>
@@ -6664,7 +6491,7 @@
               <w:rPr>
                 <w:sz w:val="19"/>
               </w:rPr>
-              <w:t>E-mail</w:t>
+              <w:t>Relations &amp; rollups</w:t>
             </w:r>
           </w:p>
         </w:tc>
@@ -6678,7 +6505,7 @@
               <w:rPr>
                 <w:sz w:val="19"/>
               </w:rPr>
-              <w:t>Invitations and mentions are stored but never e-mailed</w:t>
+              <w:t>DONE</w:t>
             </w:r>
           </w:p>
         </w:tc>
@@ -6692,7 +6519,7 @@
               <w:rPr>
                 <w:sz w:val="19"/>
               </w:rPr>
-              <w:t>Medium</w:t>
+              <w:t>Cross-database links with count/sum/avg/min/max/list rollups</w:t>
             </w:r>
           </w:p>
         </w:tc>
@@ -6708,7 +6535,7 @@
               <w:rPr>
                 <w:sz w:val="19"/>
               </w:rPr>
-              <w:t>Rate limiting</w:t>
+              <w:t>Synced blocks</w:t>
             </w:r>
           </w:p>
         </w:tc>
@@ -6722,7 +6549,7 @@
               <w:rPr>
                 <w:sz w:val="19"/>
               </w:rPr>
-              <w:t>No rate limit on the public upload endpoint</w:t>
+              <w:t>DONE</w:t>
             </w:r>
           </w:p>
         </w:tc>
@@ -6736,7 +6563,7 @@
               <w:rPr>
                 <w:sz w:val="19"/>
               </w:rPr>
-              <w:t>Medium — add it before launch</w:t>
+              <w:t>A page mirrors the content of another one and updates automatically</w:t>
             </w:r>
           </w:p>
         </w:tc>
@@ -6752,7 +6579,7 @@
               <w:rPr>
                 <w:sz w:val="19"/>
               </w:rPr>
-              <w:t>Storage</w:t>
+              <w:t>Automations</w:t>
             </w:r>
           </w:p>
         </w:tc>
@@ -6766,7 +6593,7 @@
               <w:rPr>
                 <w:sz w:val="19"/>
               </w:rPr>
-              <w:t>The local upload fallback writes to `.jotion-uploads/`</w:t>
+              <w:t>DONE</w:t>
             </w:r>
           </w:p>
         </w:tc>
@@ -6780,7 +6607,7 @@
               <w:rPr>
                 <w:sz w:val="19"/>
               </w:rPr>
-              <w:t>Low — development only</w:t>
+              <w:t>Trigger → set a property / notify the team, limited by the plan</w:t>
             </w:r>
           </w:p>
         </w:tc>
@@ -6796,7 +6623,7 @@
               <w:rPr>
                 <w:sz w:val="19"/>
               </w:rPr>
-              <w:t>Search</w:t>
+              <w:t>Import (Markdown / CSV / Notion export)</w:t>
             </w:r>
           </w:p>
         </w:tc>
@@ -6810,7 +6637,7 @@
               <w:rPr>
                 <w:sz w:val="19"/>
               </w:rPr>
-              <w:t>Full-text search scans the workspace client-side per query</w:t>
+              <w:t>DONE</w:t>
             </w:r>
           </w:p>
         </w:tc>
@@ -6824,7 +6651,7 @@
               <w:rPr>
                 <w:sz w:val="19"/>
               </w:rPr>
-              <w:t>Low until workspaces grow</w:t>
+              <w:t>All three import paths work</w:t>
             </w:r>
           </w:p>
         </w:tc>
@@ -6840,7 +6667,7 @@
               <w:rPr>
                 <w:sz w:val="19"/>
               </w:rPr>
-              <w:t>Convex upgrade</w:t>
+              <w:t>Templates with properties &amp; database presets</w:t>
             </w:r>
           </w:p>
         </w:tc>
@@ -6854,7 +6681,7 @@
               <w:rPr>
                 <w:sz w:val="19"/>
               </w:rPr>
-              <w:t>convex 1.16 → 1.47 was required for the test harness; the Clerk cast in `convex-provider.tsx` works around the type mismatch</w:t>
+              <w:t>DONE</w:t>
             </w:r>
           </w:p>
         </w:tc>
@@ -6868,7 +6695,7 @@
               <w:rPr>
                 <w:sz w:val="19"/>
               </w:rPr>
-              <w:t>Low — upgrade Clerk to v6</w:t>
+              <w:t>Templates carry properties, columns and views</w:t>
             </w:r>
           </w:p>
         </w:tc>
@@ -6884,7 +6711,7 @@
               <w:rPr>
                 <w:sz w:val="19"/>
               </w:rPr>
-              <w:t>Version history</w:t>
+              <w:t>AI writing assistant</w:t>
             </w:r>
           </w:p>
         </w:tc>
@@ -6898,7 +6725,7 @@
               <w:rPr>
                 <w:sz w:val="19"/>
               </w:rPr>
-              <w:t>Snapshots are created on every content change</w:t>
+              <w:t>DONE</w:t>
             </w:r>
           </w:p>
         </w:tc>
@@ -6912,7 +6739,271 @@
               <w:rPr>
                 <w:sz w:val="19"/>
               </w:rPr>
-              <w:t>Low — retention is plan limited</w:t>
+              <w:t>Improve, shorten, summarize, continue, translate — pluggable provider</w:t>
+            </w:r>
+          </w:p>
+        </w:tc>
+      </w:tr>
+      <w:tr>
+        <w:tc>
+          <w:tcPr>
+            <w:tcW w:type="dxa" w:w="3216"/>
+          </w:tcPr>
+          <w:p>
+            <w:r/>
+            <w:r>
+              <w:rPr>
+                <w:sz w:val="19"/>
+              </w:rPr>
+              <w:t>Slack / Google Drive / GitHub integrations</w:t>
+            </w:r>
+          </w:p>
+        </w:tc>
+        <w:tc>
+          <w:tcPr>
+            <w:tcW w:type="dxa" w:w="3216"/>
+          </w:tcPr>
+          <w:p>
+            <w:r/>
+            <w:r>
+              <w:rPr>
+                <w:sz w:val="19"/>
+              </w:rPr>
+              <w:t>OPEN</w:t>
+            </w:r>
+          </w:p>
+        </w:tc>
+        <w:tc>
+          <w:tcPr>
+            <w:tcW w:type="dxa" w:w="3216"/>
+          </w:tcPr>
+          <w:p>
+            <w:r/>
+            <w:r>
+              <w:rPr>
+                <w:sz w:val="19"/>
+              </w:rPr>
+              <w:t>Needs third-party OAuth and webhooks</w:t>
+            </w:r>
+          </w:p>
+        </w:tc>
+      </w:tr>
+      <w:tr>
+        <w:tc>
+          <w:tcPr>
+            <w:tcW w:type="dxa" w:w="3216"/>
+          </w:tcPr>
+          <w:p>
+            <w:r/>
+            <w:r>
+              <w:rPr>
+                <w:sz w:val="19"/>
+              </w:rPr>
+              <w:t>Mobile apps</w:t>
+            </w:r>
+          </w:p>
+        </w:tc>
+        <w:tc>
+          <w:tcPr>
+            <w:tcW w:type="dxa" w:w="3216"/>
+          </w:tcPr>
+          <w:p>
+            <w:r/>
+            <w:r>
+              <w:rPr>
+                <w:sz w:val="19"/>
+              </w:rPr>
+              <w:t>OPEN</w:t>
+            </w:r>
+          </w:p>
+        </w:tc>
+        <w:tc>
+          <w:tcPr>
+            <w:tcW w:type="dxa" w:w="3216"/>
+          </w:tcPr>
+          <w:p>
+            <w:r/>
+            <w:r>
+              <w:rPr>
+                <w:sz w:val="19"/>
+              </w:rPr>
+              <w:t>A React Native shell on top of the existing API</w:t>
+            </w:r>
+          </w:p>
+        </w:tc>
+      </w:tr>
+      <w:tr>
+        <w:tc>
+          <w:tcPr>
+            <w:tcW w:type="dxa" w:w="3216"/>
+          </w:tcPr>
+          <w:p>
+            <w:r/>
+            <w:r>
+              <w:rPr>
+                <w:sz w:val="19"/>
+              </w:rPr>
+              <w:t>Offline support</w:t>
+            </w:r>
+          </w:p>
+        </w:tc>
+        <w:tc>
+          <w:tcPr>
+            <w:tcW w:type="dxa" w:w="3216"/>
+          </w:tcPr>
+          <w:p>
+            <w:r/>
+            <w:r>
+              <w:rPr>
+                <w:sz w:val="19"/>
+              </w:rPr>
+              <w:t>OPEN</w:t>
+            </w:r>
+          </w:p>
+        </w:tc>
+        <w:tc>
+          <w:tcPr>
+            <w:tcW w:type="dxa" w:w="3216"/>
+          </w:tcPr>
+          <w:p>
+            <w:r/>
+            <w:r>
+              <w:rPr>
+                <w:sz w:val="19"/>
+              </w:rPr>
+              <w:t>Local cache and conflict resolution</w:t>
+            </w:r>
+          </w:p>
+        </w:tc>
+      </w:tr>
+      <w:tr>
+        <w:tc>
+          <w:tcPr>
+            <w:tcW w:type="dxa" w:w="3216"/>
+          </w:tcPr>
+          <w:p>
+            <w:r/>
+            <w:r>
+              <w:rPr>
+                <w:sz w:val="19"/>
+              </w:rPr>
+              <w:t>Public pages with comments</w:t>
+            </w:r>
+          </w:p>
+        </w:tc>
+        <w:tc>
+          <w:tcPr>
+            <w:tcW w:type="dxa" w:w="3216"/>
+          </w:tcPr>
+          <w:p>
+            <w:r/>
+            <w:r>
+              <w:rPr>
+                <w:sz w:val="19"/>
+              </w:rPr>
+              <w:t>OPEN</w:t>
+            </w:r>
+          </w:p>
+        </w:tc>
+        <w:tc>
+          <w:tcPr>
+            <w:tcW w:type="dxa" w:w="3216"/>
+          </w:tcPr>
+          <w:p>
+            <w:r/>
+            <w:r>
+              <w:rPr>
+                <w:sz w:val="19"/>
+              </w:rPr>
+              <w:t>Comments on published pages for anonymous visitors</w:t>
+            </w:r>
+          </w:p>
+        </w:tc>
+      </w:tr>
+      <w:tr>
+        <w:tc>
+          <w:tcPr>
+            <w:tcW w:type="dxa" w:w="3216"/>
+          </w:tcPr>
+          <w:p>
+            <w:r/>
+            <w:r>
+              <w:rPr>
+                <w:sz w:val="19"/>
+              </w:rPr>
+              <w:t>Per-database permissions / private teamspaces</w:t>
+            </w:r>
+          </w:p>
+        </w:tc>
+        <w:tc>
+          <w:tcPr>
+            <w:tcW w:type="dxa" w:w="3216"/>
+          </w:tcPr>
+          <w:p>
+            <w:r/>
+            <w:r>
+              <w:rPr>
+                <w:sz w:val="19"/>
+              </w:rPr>
+              <w:t>OPEN</w:t>
+            </w:r>
+          </w:p>
+        </w:tc>
+        <w:tc>
+          <w:tcPr>
+            <w:tcW w:type="dxa" w:w="3216"/>
+          </w:tcPr>
+          <w:p>
+            <w:r/>
+            <w:r>
+              <w:rPr>
+                <w:sz w:val="19"/>
+              </w:rPr>
+              <w:t>Finer grained access control</w:t>
+            </w:r>
+          </w:p>
+        </w:tc>
+      </w:tr>
+      <w:tr>
+        <w:tc>
+          <w:tcPr>
+            <w:tcW w:type="dxa" w:w="3216"/>
+          </w:tcPr>
+          <w:p>
+            <w:r/>
+            <w:r>
+              <w:rPr>
+                <w:sz w:val="19"/>
+              </w:rPr>
+              <w:t>Real payment processing</w:t>
+            </w:r>
+          </w:p>
+        </w:tc>
+        <w:tc>
+          <w:tcPr>
+            <w:tcW w:type="dxa" w:w="3216"/>
+          </w:tcPr>
+          <w:p>
+            <w:r/>
+            <w:r>
+              <w:rPr>
+                <w:sz w:val="19"/>
+              </w:rPr>
+              <w:t>OPEN</w:t>
+            </w:r>
+          </w:p>
+        </w:tc>
+        <w:tc>
+          <w:tcPr>
+            <w:tcW w:type="dxa" w:w="3216"/>
+          </w:tcPr>
+          <w:p>
+            <w:r/>
+            <w:r>
+              <w:rPr>
+                <w:sz w:val="19"/>
+              </w:rPr>
+              <w:t>Replace the demo checkout with Stripe</w:t>
             </w:r>
           </w:p>
         </w:tc>
@@ -6921,31 +7012,70 @@
     <w:p/>
     <w:p>
       <w:pPr>
-        <w:pStyle w:val="Heading1"/>
+        <w:pStyle w:val="Heading2"/>
       </w:pPr>
       <w:r>
-        <w:t>7. Manual QA checklist</w:t>
+        <w:t>5.4 Later</w:t>
       </w:r>
     </w:p>
     <w:p>
+      <w:pPr>
+        <w:pStyle w:val="ListBullet"/>
+        <w:spacing w:after="40"/>
+        <w:ind w:left="432"/>
+      </w:pPr>
       <w:r>
         <w:rPr>
           <w:sz w:val="21"/>
         </w:rPr>
-        <w:t xml:space="preserve">Run through this after </w:t>
-      </w:r>
-      <w:r>
-        <w:rPr>
-          <w:rFonts w:ascii="Consolas" w:hAnsi="Consolas"/>
-          <w:sz w:val="19"/>
-        </w:rPr>
-        <w:t>npx convex dev</w:t>
-      </w:r>
+        <w:t>Replace the demo checkout with a real payment provider (Stripe) — the billing model is already provider-agnostic.</w:t>
+      </w:r>
+    </w:p>
+    <w:p>
+      <w:pPr>
+        <w:pStyle w:val="ListBullet"/>
+        <w:spacing w:after="40"/>
+        <w:ind w:left="432"/>
+      </w:pPr>
       <w:r>
         <w:rPr>
           <w:sz w:val="21"/>
         </w:rPr>
-        <w:t xml:space="preserve"> has been run:</w:t>
+        <w:t>Multi-region data residency (the Enterprise plan advertises it).</w:t>
+      </w:r>
+    </w:p>
+    <w:p>
+      <w:pPr>
+        <w:pStyle w:val="ListBullet"/>
+        <w:spacing w:after="40"/>
+        <w:ind w:left="432"/>
+      </w:pPr>
+      <w:r>
+        <w:rPr>
+          <w:sz w:val="21"/>
+        </w:rPr>
+        <w:t>Public pages with comments and reactions.</w:t>
+      </w:r>
+    </w:p>
+    <w:p>
+      <w:pPr>
+        <w:pStyle w:val="ListBullet"/>
+        <w:spacing w:after="40"/>
+        <w:ind w:left="432"/>
+      </w:pPr>
+      <w:r>
+        <w:rPr>
+          <w:sz w:val="21"/>
+        </w:rPr>
+        <w:t>Per-database permissions and private teamspaces.</w:t>
+      </w:r>
+    </w:p>
+    <w:p>
+      <w:pPr>
+        <w:pStyle w:val="Heading1"/>
+      </w:pPr>
+      <w:r>
+        <w:t>6. Known limitations &amp; risks</w:t>
       </w:r>
     </w:p>
     <w:tbl>
@@ -6971,6 +7101,403 @@
                 <w:b/>
                 <w:sz w:val="19"/>
               </w:rPr>
+              <w:t>Area</w:t>
+            </w:r>
+          </w:p>
+        </w:tc>
+        <w:tc>
+          <w:tcPr>
+            <w:tcW w:type="dxa" w:w="3216"/>
+          </w:tcPr>
+          <w:p>
+            <w:r/>
+            <w:r>
+              <w:rPr>
+                <w:b/>
+                <w:sz w:val="19"/>
+              </w:rPr>
+              <w:t>Limitation</w:t>
+            </w:r>
+          </w:p>
+        </w:tc>
+        <w:tc>
+          <w:tcPr>
+            <w:tcW w:type="dxa" w:w="3216"/>
+          </w:tcPr>
+          <w:p>
+            <w:r/>
+            <w:r>
+              <w:rPr>
+                <w:b/>
+                <w:sz w:val="19"/>
+              </w:rPr>
+              <w:t>Risk</w:t>
+            </w:r>
+          </w:p>
+        </w:tc>
+      </w:tr>
+      <w:tr>
+        <w:tc>
+          <w:tcPr>
+            <w:tcW w:type="dxa" w:w="3216"/>
+          </w:tcPr>
+          <w:p>
+            <w:r/>
+            <w:r>
+              <w:rPr>
+                <w:sz w:val="19"/>
+              </w:rPr>
+              <w:t>Payments</w:t>
+            </w:r>
+          </w:p>
+        </w:tc>
+        <w:tc>
+          <w:tcPr>
+            <w:tcW w:type="dxa" w:w="3216"/>
+          </w:tcPr>
+          <w:p>
+            <w:r/>
+            <w:r>
+              <w:rPr>
+                <w:sz w:val="19"/>
+              </w:rPr>
+              <w:t>The card form is a demo — no real processor is connected</w:t>
+            </w:r>
+          </w:p>
+        </w:tc>
+        <w:tc>
+          <w:tcPr>
+            <w:tcW w:type="dxa" w:w="3216"/>
+          </w:tcPr>
+          <w:p>
+            <w:r/>
+            <w:r>
+              <w:rPr>
+                <w:sz w:val="19"/>
+              </w:rPr>
+              <w:t>Medium — do not market as paid</w:t>
+            </w:r>
+          </w:p>
+        </w:tc>
+      </w:tr>
+      <w:tr>
+        <w:tc>
+          <w:tcPr>
+            <w:tcW w:type="dxa" w:w="3216"/>
+          </w:tcPr>
+          <w:p>
+            <w:r/>
+            <w:r>
+              <w:rPr>
+                <w:sz w:val="19"/>
+              </w:rPr>
+              <w:t>E-mail</w:t>
+            </w:r>
+          </w:p>
+        </w:tc>
+        <w:tc>
+          <w:tcPr>
+            <w:tcW w:type="dxa" w:w="3216"/>
+          </w:tcPr>
+          <w:p>
+            <w:r/>
+            <w:r>
+              <w:rPr>
+                <w:sz w:val="19"/>
+              </w:rPr>
+              <w:t>Invitations and mentions are stored but never e-mailed</w:t>
+            </w:r>
+          </w:p>
+        </w:tc>
+        <w:tc>
+          <w:tcPr>
+            <w:tcW w:type="dxa" w:w="3216"/>
+          </w:tcPr>
+          <w:p>
+            <w:r/>
+            <w:r>
+              <w:rPr>
+                <w:sz w:val="19"/>
+              </w:rPr>
+              <w:t>Medium</w:t>
+            </w:r>
+          </w:p>
+        </w:tc>
+      </w:tr>
+      <w:tr>
+        <w:tc>
+          <w:tcPr>
+            <w:tcW w:type="dxa" w:w="3216"/>
+          </w:tcPr>
+          <w:p>
+            <w:r/>
+            <w:r>
+              <w:rPr>
+                <w:sz w:val="19"/>
+              </w:rPr>
+              <w:t>Rate limiting</w:t>
+            </w:r>
+          </w:p>
+        </w:tc>
+        <w:tc>
+          <w:tcPr>
+            <w:tcW w:type="dxa" w:w="3216"/>
+          </w:tcPr>
+          <w:p>
+            <w:r/>
+            <w:r>
+              <w:rPr>
+                <w:sz w:val="19"/>
+              </w:rPr>
+              <w:t>No rate limit on the public upload endpoint</w:t>
+            </w:r>
+          </w:p>
+        </w:tc>
+        <w:tc>
+          <w:tcPr>
+            <w:tcW w:type="dxa" w:w="3216"/>
+          </w:tcPr>
+          <w:p>
+            <w:r/>
+            <w:r>
+              <w:rPr>
+                <w:sz w:val="19"/>
+              </w:rPr>
+              <w:t>Medium — add it before launch</w:t>
+            </w:r>
+          </w:p>
+        </w:tc>
+      </w:tr>
+      <w:tr>
+        <w:tc>
+          <w:tcPr>
+            <w:tcW w:type="dxa" w:w="3216"/>
+          </w:tcPr>
+          <w:p>
+            <w:r/>
+            <w:r>
+              <w:rPr>
+                <w:sz w:val="19"/>
+              </w:rPr>
+              <w:t>Storage</w:t>
+            </w:r>
+          </w:p>
+        </w:tc>
+        <w:tc>
+          <w:tcPr>
+            <w:tcW w:type="dxa" w:w="3216"/>
+          </w:tcPr>
+          <w:p>
+            <w:r/>
+            <w:r>
+              <w:rPr>
+                <w:sz w:val="19"/>
+              </w:rPr>
+              <w:t>The local upload fallback writes to `.jotion-uploads/`</w:t>
+            </w:r>
+          </w:p>
+        </w:tc>
+        <w:tc>
+          <w:tcPr>
+            <w:tcW w:type="dxa" w:w="3216"/>
+          </w:tcPr>
+          <w:p>
+            <w:r/>
+            <w:r>
+              <w:rPr>
+                <w:sz w:val="19"/>
+              </w:rPr>
+              <w:t>Low — development only</w:t>
+            </w:r>
+          </w:p>
+        </w:tc>
+      </w:tr>
+      <w:tr>
+        <w:tc>
+          <w:tcPr>
+            <w:tcW w:type="dxa" w:w="3216"/>
+          </w:tcPr>
+          <w:p>
+            <w:r/>
+            <w:r>
+              <w:rPr>
+                <w:sz w:val="19"/>
+              </w:rPr>
+              <w:t>Search</w:t>
+            </w:r>
+          </w:p>
+        </w:tc>
+        <w:tc>
+          <w:tcPr>
+            <w:tcW w:type="dxa" w:w="3216"/>
+          </w:tcPr>
+          <w:p>
+            <w:r/>
+            <w:r>
+              <w:rPr>
+                <w:sz w:val="19"/>
+              </w:rPr>
+              <w:t>Full-text search scans the workspace client-side per query</w:t>
+            </w:r>
+          </w:p>
+        </w:tc>
+        <w:tc>
+          <w:tcPr>
+            <w:tcW w:type="dxa" w:w="3216"/>
+          </w:tcPr>
+          <w:p>
+            <w:r/>
+            <w:r>
+              <w:rPr>
+                <w:sz w:val="19"/>
+              </w:rPr>
+              <w:t>Low until workspaces grow</w:t>
+            </w:r>
+          </w:p>
+        </w:tc>
+      </w:tr>
+      <w:tr>
+        <w:tc>
+          <w:tcPr>
+            <w:tcW w:type="dxa" w:w="3216"/>
+          </w:tcPr>
+          <w:p>
+            <w:r/>
+            <w:r>
+              <w:rPr>
+                <w:sz w:val="19"/>
+              </w:rPr>
+              <w:t>Convex upgrade</w:t>
+            </w:r>
+          </w:p>
+        </w:tc>
+        <w:tc>
+          <w:tcPr>
+            <w:tcW w:type="dxa" w:w="3216"/>
+          </w:tcPr>
+          <w:p>
+            <w:r/>
+            <w:r>
+              <w:rPr>
+                <w:sz w:val="19"/>
+              </w:rPr>
+              <w:t>convex 1.16 → 1.47 was required for the test harness; the Clerk cast in `convex-provider.tsx` works around the type mismatch</w:t>
+            </w:r>
+          </w:p>
+        </w:tc>
+        <w:tc>
+          <w:tcPr>
+            <w:tcW w:type="dxa" w:w="3216"/>
+          </w:tcPr>
+          <w:p>
+            <w:r/>
+            <w:r>
+              <w:rPr>
+                <w:sz w:val="19"/>
+              </w:rPr>
+              <w:t>Low — upgrade Clerk to v6</w:t>
+            </w:r>
+          </w:p>
+        </w:tc>
+      </w:tr>
+      <w:tr>
+        <w:tc>
+          <w:tcPr>
+            <w:tcW w:type="dxa" w:w="3216"/>
+          </w:tcPr>
+          <w:p>
+            <w:r/>
+            <w:r>
+              <w:rPr>
+                <w:sz w:val="19"/>
+              </w:rPr>
+              <w:t>Version history</w:t>
+            </w:r>
+          </w:p>
+        </w:tc>
+        <w:tc>
+          <w:tcPr>
+            <w:tcW w:type="dxa" w:w="3216"/>
+          </w:tcPr>
+          <w:p>
+            <w:r/>
+            <w:r>
+              <w:rPr>
+                <w:sz w:val="19"/>
+              </w:rPr>
+              <w:t>Snapshots are created on every content change</w:t>
+            </w:r>
+          </w:p>
+        </w:tc>
+        <w:tc>
+          <w:tcPr>
+            <w:tcW w:type="dxa" w:w="3216"/>
+          </w:tcPr>
+          <w:p>
+            <w:r/>
+            <w:r>
+              <w:rPr>
+                <w:sz w:val="19"/>
+              </w:rPr>
+              <w:t>Low — retention is plan limited</w:t>
+            </w:r>
+          </w:p>
+        </w:tc>
+      </w:tr>
+    </w:tbl>
+    <w:p/>
+    <w:p>
+      <w:pPr>
+        <w:pStyle w:val="Heading1"/>
+      </w:pPr>
+      <w:r>
+        <w:t>7. Manual QA checklist</w:t>
+      </w:r>
+    </w:p>
+    <w:p>
+      <w:r>
+        <w:rPr>
+          <w:sz w:val="21"/>
+        </w:rPr>
+        <w:t xml:space="preserve">Run through this after </w:t>
+      </w:r>
+      <w:r>
+        <w:rPr>
+          <w:rFonts w:ascii="Consolas" w:hAnsi="Consolas"/>
+          <w:sz w:val="19"/>
+        </w:rPr>
+        <w:t>npx convex dev</w:t>
+      </w:r>
+      <w:r>
+        <w:rPr>
+          <w:sz w:val="21"/>
+        </w:rPr>
+        <w:t xml:space="preserve"> has been run:</w:t>
+      </w:r>
+    </w:p>
+    <w:tbl>
+      <w:tblPr>
+        <w:tblStyle w:val="LightGrid-Accent1"/>
+        <w:tblW w:type="auto" w:w="0"/>
+        <w:tblLook w:firstColumn="1" w:firstRow="1" w:lastColumn="0" w:lastRow="0" w:noHBand="0" w:noVBand="1" w:val="04A0"/>
+      </w:tblPr>
+      <w:tblGrid>
+        <w:gridCol w:w="3216"/>
+        <w:gridCol w:w="3216"/>
+        <w:gridCol w:w="3216"/>
+      </w:tblGrid>
+      <w:tr>
+        <w:tc>
+          <w:tcPr>
+            <w:tcW w:type="dxa" w:w="3216"/>
+          </w:tcPr>
+          <w:p>
+            <w:r/>
+            <w:r>
+              <w:rPr>
+                <w:b/>
+                <w:sz w:val="19"/>
+              </w:rPr>
               <w:t>#</w:t>
             </w:r>
           </w:p>
@@ -8900,6 +9427,126 @@
                 <w:sz w:val="19"/>
               </w:rPr>
               <w:t>The full pre-deployment check</w:t>
+            </w:r>
+          </w:p>
+        </w:tc>
+      </w:tr>
+      <w:tr>
+        <w:tc>
+          <w:tcPr>
+            <w:tcW w:type="dxa" w:w="4824"/>
+          </w:tcPr>
+          <w:p>
+            <w:r/>
+            <w:r>
+              <w:rPr>
+                <w:sz w:val="19"/>
+              </w:rPr>
+              <w:t>docs/DEPLOYMENT.md</w:t>
+            </w:r>
+          </w:p>
+        </w:tc>
+        <w:tc>
+          <w:tcPr>
+            <w:tcW w:type="dxa" w:w="4824"/>
+          </w:tcPr>
+          <w:p>
+            <w:r/>
+            <w:r>
+              <w:rPr>
+                <w:sz w:val="19"/>
+              </w:rPr>
+              <w:t>The step-by-step deployment guide</w:t>
+            </w:r>
+          </w:p>
+        </w:tc>
+      </w:tr>
+      <w:tr>
+        <w:tc>
+          <w:tcPr>
+            <w:tcW w:type="dxa" w:w="4824"/>
+          </w:tcPr>
+          <w:p>
+            <w:r/>
+            <w:r>
+              <w:rPr>
+                <w:sz w:val="19"/>
+              </w:rPr>
+              <w:t>components/providers/configuration-check.tsx</w:t>
+            </w:r>
+          </w:p>
+        </w:tc>
+        <w:tc>
+          <w:tcPr>
+            <w:tcW w:type="dxa" w:w="4824"/>
+          </w:tcPr>
+          <w:p>
+            <w:r/>
+            <w:r>
+              <w:rPr>
+                <w:sz w:val="19"/>
+              </w:rPr>
+              <w:t>Explains a missing environment variable instead of crashing</w:t>
+            </w:r>
+          </w:p>
+        </w:tc>
+      </w:tr>
+      <w:tr>
+        <w:tc>
+          <w:tcPr>
+            <w:tcW w:type="dxa" w:w="4824"/>
+          </w:tcPr>
+          <w:p>
+            <w:r/>
+            <w:r>
+              <w:rPr>
+                <w:sz w:val="19"/>
+              </w:rPr>
+              <w:t>hooks/use-safe-search-params.ts</w:t>
+            </w:r>
+          </w:p>
+        </w:tc>
+        <w:tc>
+          <w:tcPr>
+            <w:tcW w:type="dxa" w:w="4824"/>
+          </w:tcPr>
+          <w:p>
+            <w:r/>
+            <w:r>
+              <w:rPr>
+                <w:sz w:val="19"/>
+              </w:rPr>
+              <w:t>A null-safe `useSearchParams()`</w:t>
+            </w:r>
+          </w:p>
+        </w:tc>
+      </w:tr>
+      <w:tr>
+        <w:tc>
+          <w:tcPr>
+            <w:tcW w:type="dxa" w:w="4824"/>
+          </w:tcPr>
+          <w:p>
+            <w:r/>
+            <w:r>
+              <w:rPr>
+                <w:sz w:val="19"/>
+              </w:rPr>
+              <w:t>lib/upload-dir.ts</w:t>
+            </w:r>
+          </w:p>
+        </w:tc>
+        <w:tc>
+          <w:tcPr>
+            <w:tcW w:type="dxa" w:w="4824"/>
+          </w:tcPr>
+          <w:p>
+            <w:r/>
+            <w:r>
+              <w:rPr>
+                <w:sz w:val="19"/>
+              </w:rPr>
+              <w:t>The upload directory for local and serverless runtimes</w:t>
             </w:r>
           </w:p>
         </w:tc>

</xml_diff>